<commit_message>
Added new command to modem, also changed fuel calculation for liters
</commit_message>
<xml_diff>
--- a/Documentation/MQTT Messaging.docx
+++ b/Documentation/MQTT Messaging.docx
@@ -245,8 +245,6 @@
           <w:szCs w:val="20"/>
         </w:rPr>
       </w:pPr>
-      <w:bookmarkStart w:id="0" w:name="_GoBack"/>
-      <w:bookmarkEnd w:id="0"/>
     </w:p>
     <w:p>
       <w:pPr>
@@ -273,52 +271,790 @@
       </w:r>
       <w:proofErr w:type="gramEnd"/>
       <w:r>
+        <w:t xml:space="preserve">    </w:t>
+      </w:r>
+      <w:proofErr w:type="spellStart"/>
+      <w:r>
+        <w:t>setTimedate:epoch|</w:t>
+      </w:r>
+      <w:r>
+        <w:rPr>
+          <w:u w:val="single"/>
+        </w:rPr>
+        <w:t>timezone</w:t>
+      </w:r>
+      <w:proofErr w:type="spellEnd"/>
+      <w:r>
+        <w:t xml:space="preserve">    </w:t>
+      </w:r>
+      <w:proofErr w:type="spellStart"/>
+      <w:r>
+        <w:t>Reply:ACK</w:t>
+      </w:r>
+      <w:proofErr w:type="spellEnd"/>
+      <w:r>
+        <w:t>/NACK</w:t>
+      </w:r>
+    </w:p>
+    <w:p>
+      <w:pPr>
+        <w:rPr>
+          <w:color w:val="000000"/>
+        </w:rPr>
+      </w:pPr>
+      <w:r>
+        <w:rPr>
+          <w:color w:val="000000"/>
+        </w:rPr>
+        <w:tab/>
+      </w:r>
+      <w:r>
+        <w:rPr>
+          <w:color w:val="000000"/>
+        </w:rPr>
+        <w:tab/>
+      </w:r>
+    </w:p>
+    <w:p>
+      <w:pPr>
+        <w:rPr>
+          <w:color w:val="000000"/>
+        </w:rPr>
+      </w:pPr>
+    </w:p>
+    <w:p>
+      <w:pPr>
+        <w:rPr>
+          <w:color w:val="000000"/>
+        </w:rPr>
+      </w:pPr>
+      <w:proofErr w:type="gramStart"/>
+      <w:r>
+        <w:t>format</w:t>
+      </w:r>
+      <w:proofErr w:type="gramEnd"/>
+      <w:r>
+        <w:t xml:space="preserve">   </w:t>
+      </w:r>
+      <w:proofErr w:type="spellStart"/>
+      <w:r>
+        <w:t>setFuelMeasurement:</w:t>
+      </w:r>
+      <w:r>
+        <w:rPr>
+          <w:u w:val="single"/>
+        </w:rPr>
+        <w:t>zerospan</w:t>
+      </w:r>
+      <w:r>
+        <w:t>|</w:t>
+      </w:r>
+      <w:r>
+        <w:rPr>
+          <w:u w:val="single"/>
+        </w:rPr>
+        <w:t>fullspan</w:t>
+      </w:r>
+      <w:proofErr w:type="spellEnd"/>
+      <w:r>
+        <w:t xml:space="preserve">  </w:t>
+      </w:r>
+      <w:proofErr w:type="spellStart"/>
+      <w:r>
+        <w:t>Reply:ACK</w:t>
+      </w:r>
+      <w:proofErr w:type="spellEnd"/>
+      <w:r>
+        <w:t>/NACK</w:t>
+      </w:r>
+    </w:p>
+    <w:p>
+      <w:pPr>
+        <w:rPr>
+          <w:color w:val="000000"/>
+        </w:rPr>
+      </w:pPr>
+    </w:p>
+    <w:p>
+      <w:pPr>
+        <w:rPr>
+          <w:color w:val="000000"/>
+        </w:rPr>
+      </w:pPr>
+    </w:p>
+    <w:p>
+      <w:pPr>
+        <w:rPr>
+          <w:color w:val="000000"/>
+        </w:rPr>
+      </w:pPr>
+    </w:p>
+    <w:p>
+      <w:pPr>
+        <w:rPr>
+          <w:color w:val="000000"/>
+        </w:rPr>
+      </w:pPr>
+      <w:proofErr w:type="gramStart"/>
+      <w:r>
+        <w:t>format</w:t>
+      </w:r>
+      <w:proofErr w:type="gramEnd"/>
+      <w:r>
+        <w:t xml:space="preserve">   </w:t>
+      </w:r>
+      <w:proofErr w:type="spellStart"/>
+      <w:r>
+        <w:t>setSoCnDCur:SOC|CurrentOffset</w:t>
+      </w:r>
+      <w:proofErr w:type="spellEnd"/>
+      <w:r>
+        <w:t xml:space="preserve">    </w:t>
+      </w:r>
+      <w:proofErr w:type="spellStart"/>
+      <w:r>
+        <w:t>Reply:ACK</w:t>
+      </w:r>
+      <w:proofErr w:type="spellEnd"/>
+      <w:r>
+        <w:t>/NACK</w:t>
+      </w:r>
+    </w:p>
+    <w:p>
+      <w:pPr>
+        <w:rPr>
+          <w:color w:val="000000"/>
+        </w:rPr>
+      </w:pPr>
+    </w:p>
+    <w:p>
+      <w:pPr>
+        <w:rPr>
+          <w:color w:val="000000"/>
+        </w:rPr>
+      </w:pPr>
+    </w:p>
+    <w:p>
+      <w:pPr>
+        <w:rPr>
+          <w:color w:val="000000"/>
+        </w:rPr>
+      </w:pPr>
+      <w:proofErr w:type="gramStart"/>
+      <w:r>
+        <w:t>format</w:t>
+      </w:r>
+      <w:proofErr w:type="gramEnd"/>
+      <w:r>
+        <w:t xml:space="preserve">   </w:t>
+      </w:r>
+      <w:proofErr w:type="spellStart"/>
+      <w:r>
+        <w:t>setAutoManualMode</w:t>
+      </w:r>
+      <w:proofErr w:type="spellEnd"/>
+      <w:r>
+        <w:t xml:space="preserve">:(0 - Auto   1 - Manual) </w:t>
+      </w:r>
+      <w:proofErr w:type="spellStart"/>
+      <w:r>
+        <w:t>Reply:ACK</w:t>
+      </w:r>
+      <w:proofErr w:type="spellEnd"/>
+      <w:r>
+        <w:t>/NACK</w:t>
+      </w:r>
+    </w:p>
+    <w:p>
+      <w:pPr>
+        <w:rPr>
+          <w:color w:val="000000"/>
+        </w:rPr>
+      </w:pPr>
+    </w:p>
+    <w:p>
+      <w:pPr>
+        <w:rPr>
+          <w:color w:val="000000"/>
+        </w:rPr>
+      </w:pPr>
+    </w:p>
+    <w:p>
+      <w:pPr>
+        <w:rPr>
+          <w:color w:val="000000"/>
+        </w:rPr>
+      </w:pPr>
+      <w:proofErr w:type="gramStart"/>
+      <w:r>
+        <w:t>format</w:t>
+      </w:r>
+      <w:proofErr w:type="gramEnd"/>
+      <w:r>
+        <w:t xml:space="preserve">   </w:t>
+      </w:r>
+      <w:proofErr w:type="spellStart"/>
+      <w:r>
+        <w:t>setGenerator</w:t>
+      </w:r>
+      <w:proofErr w:type="spellEnd"/>
+      <w:r>
+        <w:t xml:space="preserve">: (0 - </w:t>
+      </w:r>
+      <w:proofErr w:type="spellStart"/>
+      <w:r>
+        <w:t>GeneratorOff</w:t>
+      </w:r>
+      <w:proofErr w:type="spellEnd"/>
+      <w:r>
+        <w:t xml:space="preserve">   1 - </w:t>
+      </w:r>
+      <w:proofErr w:type="spellStart"/>
+      <w:r>
+        <w:t>GeneratorOn</w:t>
+      </w:r>
+      <w:proofErr w:type="spellEnd"/>
+      <w:r>
+        <w:t xml:space="preserve">)  </w:t>
+      </w:r>
+      <w:proofErr w:type="spellStart"/>
+      <w:r>
+        <w:t>Reply:ACK</w:t>
+      </w:r>
+      <w:proofErr w:type="spellEnd"/>
+      <w:r>
+        <w:t>/NACK</w:t>
+      </w:r>
+    </w:p>
+    <w:p>
+      <w:pPr>
+        <w:rPr>
+          <w:color w:val="000000"/>
+        </w:rPr>
+      </w:pPr>
+    </w:p>
+    <w:p>
+      <w:pPr>
+        <w:rPr>
+          <w:rFonts w:ascii="Consolas" w:hAnsi="Consolas"/>
+          <w:color w:val="3F7F5F"/>
+          <w:sz w:val="20"/>
+          <w:szCs w:val="20"/>
+          <w:shd w:val="clear" w:color="auto" w:fill="FFFFFF"/>
+        </w:rPr>
+      </w:pPr>
+      <w:proofErr w:type="gramStart"/>
+      <w:r>
+        <w:t>format</w:t>
+      </w:r>
+      <w:proofErr w:type="gramEnd"/>
+      <w:r>
         <w:t xml:space="preserve"> </w:t>
       </w:r>
+      <w:proofErr w:type="spellStart"/>
+      <w:r>
+        <w:rPr>
+          <w:rFonts w:ascii="Consolas" w:hAnsi="Consolas"/>
+          <w:color w:val="3F7F5F"/>
+          <w:sz w:val="20"/>
+          <w:szCs w:val="20"/>
+          <w:shd w:val="clear" w:color="auto" w:fill="FFFFFF"/>
+        </w:rPr>
+        <w:t>setFixSOCCharging</w:t>
+      </w:r>
+      <w:proofErr w:type="spellEnd"/>
+      <w:r>
+        <w:rPr>
+          <w:rFonts w:ascii="Consolas" w:hAnsi="Consolas"/>
+          <w:color w:val="3F7F5F"/>
+          <w:sz w:val="20"/>
+          <w:szCs w:val="20"/>
+          <w:shd w:val="clear" w:color="auto" w:fill="FFFFFF"/>
+        </w:rPr>
+        <w:t xml:space="preserve">:(0 - </w:t>
+      </w:r>
+      <w:r>
+        <w:rPr>
+          <w:rFonts w:ascii="Consolas" w:hAnsi="Consolas"/>
+          <w:color w:val="3F7F5F"/>
+          <w:sz w:val="20"/>
+          <w:szCs w:val="20"/>
+          <w:u w:val="single"/>
+          <w:shd w:val="clear" w:color="auto" w:fill="FFFFFF"/>
+        </w:rPr>
+        <w:t>turnoff</w:t>
+      </w:r>
+      <w:r>
+        <w:rPr>
+          <w:rFonts w:ascii="Consolas" w:hAnsi="Consolas"/>
+          <w:color w:val="3F7F5F"/>
+          <w:sz w:val="20"/>
+          <w:szCs w:val="20"/>
+          <w:shd w:val="clear" w:color="auto" w:fill="FFFFFF"/>
+        </w:rPr>
+        <w:t xml:space="preserve"> 1 - </w:t>
+      </w:r>
+      <w:proofErr w:type="spellStart"/>
+      <w:r>
+        <w:rPr>
+          <w:rFonts w:ascii="Consolas" w:hAnsi="Consolas"/>
+          <w:color w:val="3F7F5F"/>
+          <w:sz w:val="20"/>
+          <w:szCs w:val="20"/>
+          <w:shd w:val="clear" w:color="auto" w:fill="FFFFFF"/>
+        </w:rPr>
+        <w:t>turnOm</w:t>
+      </w:r>
+      <w:proofErr w:type="spellEnd"/>
+      <w:r>
+        <w:rPr>
+          <w:rFonts w:ascii="Consolas" w:hAnsi="Consolas"/>
+          <w:color w:val="3F7F5F"/>
+          <w:sz w:val="20"/>
+          <w:szCs w:val="20"/>
+          <w:shd w:val="clear" w:color="auto" w:fill="FFFFFF"/>
+        </w:rPr>
+        <w:t>)</w:t>
+      </w:r>
+    </w:p>
+    <w:p>
+      <w:pPr>
+        <w:rPr>
+          <w:rFonts w:ascii="Consolas" w:hAnsi="Consolas"/>
+          <w:color w:val="3F7F5F"/>
+          <w:sz w:val="20"/>
+          <w:szCs w:val="20"/>
+          <w:shd w:val="clear" w:color="auto" w:fill="FFFFFF"/>
+        </w:rPr>
+      </w:pPr>
+    </w:p>
+    <w:p>
+      <w:pPr>
+        <w:rPr>
+          <w:rFonts w:ascii="Consolas" w:hAnsi="Consolas"/>
+          <w:color w:val="3F7F5F"/>
+          <w:sz w:val="20"/>
+          <w:szCs w:val="20"/>
+          <w:shd w:val="clear" w:color="auto" w:fill="FFFFFF"/>
+        </w:rPr>
+      </w:pPr>
+    </w:p>
+    <w:p>
+      <w:pPr>
+        <w:rPr>
+          <w:rFonts w:ascii="Consolas" w:hAnsi="Consolas"/>
+          <w:color w:val="3F7F5F"/>
+          <w:sz w:val="20"/>
+          <w:szCs w:val="20"/>
+          <w:shd w:val="clear" w:color="auto" w:fill="FFFFFF"/>
+        </w:rPr>
+      </w:pPr>
+    </w:p>
+    <w:p>
+      <w:pPr>
+        <w:rPr>
+          <w:rFonts w:ascii="Consolas" w:hAnsi="Consolas"/>
+          <w:color w:val="3F7F5F"/>
+          <w:sz w:val="20"/>
+          <w:szCs w:val="20"/>
+          <w:shd w:val="clear" w:color="auto" w:fill="FFFFFF"/>
+        </w:rPr>
+      </w:pPr>
+      <w:proofErr w:type="gramStart"/>
+      <w:r>
+        <w:rPr>
+          <w:rFonts w:ascii="Consolas" w:hAnsi="Consolas"/>
+          <w:color w:val="3F7F5F"/>
+          <w:sz w:val="20"/>
+          <w:szCs w:val="20"/>
+          <w:shd w:val="clear" w:color="auto" w:fill="FFFFFF"/>
+        </w:rPr>
+        <w:t>depending</w:t>
+      </w:r>
+      <w:proofErr w:type="gramEnd"/>
+      <w:r>
+        <w:rPr>
+          <w:rFonts w:ascii="Consolas" w:hAnsi="Consolas"/>
+          <w:color w:val="3F7F5F"/>
+          <w:sz w:val="20"/>
+          <w:szCs w:val="20"/>
+          <w:shd w:val="clear" w:color="auto" w:fill="FFFFFF"/>
+        </w:rPr>
+        <w:t xml:space="preserve"> on tank type you can send different kind of format</w:t>
+      </w:r>
+    </w:p>
+    <w:p>
+      <w:pPr>
+        <w:rPr>
+          <w:rFonts w:ascii="Consolas" w:hAnsi="Consolas"/>
+          <w:color w:val="3F7F5F"/>
+          <w:sz w:val="20"/>
+          <w:szCs w:val="20"/>
+          <w:shd w:val="clear" w:color="auto" w:fill="FFFFFF"/>
+        </w:rPr>
+      </w:pPr>
+      <w:r>
+        <w:rPr>
+          <w:rFonts w:ascii="Consolas" w:hAnsi="Consolas"/>
+          <w:color w:val="3F7F5F"/>
+          <w:sz w:val="20"/>
+          <w:szCs w:val="20"/>
+          <w:shd w:val="clear" w:color="auto" w:fill="FFFFFF"/>
+        </w:rPr>
+        <w:t>All the values should be in meter for measurement</w:t>
+      </w:r>
+    </w:p>
+    <w:p>
+      <w:pPr>
+        <w:rPr>
+          <w:rFonts w:ascii="Consolas" w:hAnsi="Consolas"/>
+          <w:color w:val="3F7F5F"/>
+          <w:sz w:val="20"/>
+          <w:szCs w:val="20"/>
+          <w:shd w:val="clear" w:color="auto" w:fill="FFFFFF"/>
+        </w:rPr>
+      </w:pPr>
+      <w:proofErr w:type="spellStart"/>
+      <w:r>
+        <w:rPr>
+          <w:rFonts w:ascii="Consolas" w:hAnsi="Consolas"/>
+          <w:color w:val="3F7F5F"/>
+          <w:sz w:val="20"/>
+          <w:szCs w:val="20"/>
+          <w:shd w:val="clear" w:color="auto" w:fill="FFFFFF"/>
+        </w:rPr>
+        <w:t>TankType</w:t>
+      </w:r>
+      <w:proofErr w:type="spellEnd"/>
+      <w:r>
+        <w:rPr>
+          <w:rFonts w:ascii="Consolas" w:hAnsi="Consolas"/>
+          <w:color w:val="3F7F5F"/>
+          <w:sz w:val="20"/>
+          <w:szCs w:val="20"/>
+          <w:shd w:val="clear" w:color="auto" w:fill="FFFFFF"/>
+        </w:rPr>
+        <w:t xml:space="preserve"> = 0 (</w:t>
+      </w:r>
+      <w:proofErr w:type="spellStart"/>
+      <w:r>
+        <w:rPr>
+          <w:rFonts w:ascii="Consolas" w:hAnsi="Consolas"/>
+          <w:color w:val="3F7F5F"/>
+          <w:sz w:val="20"/>
+          <w:szCs w:val="20"/>
+          <w:shd w:val="clear" w:color="auto" w:fill="FFFFFF"/>
+        </w:rPr>
+        <w:t>Cylnderical</w:t>
+      </w:r>
+      <w:proofErr w:type="spellEnd"/>
+      <w:r>
+        <w:rPr>
+          <w:rFonts w:ascii="Consolas" w:hAnsi="Consolas"/>
+          <w:color w:val="3F7F5F"/>
+          <w:sz w:val="20"/>
+          <w:szCs w:val="20"/>
+          <w:shd w:val="clear" w:color="auto" w:fill="FFFFFF"/>
+        </w:rPr>
+        <w:t>)</w:t>
+      </w:r>
+    </w:p>
+    <w:p>
+      <w:pPr>
+        <w:rPr>
+          <w:rFonts w:ascii="Consolas" w:hAnsi="Consolas"/>
+          <w:color w:val="3F7F5F"/>
+          <w:sz w:val="20"/>
+          <w:szCs w:val="20"/>
+          <w:shd w:val="clear" w:color="auto" w:fill="FFFFFF"/>
+        </w:rPr>
+      </w:pPr>
+      <w:proofErr w:type="spellStart"/>
+      <w:r>
+        <w:rPr>
+          <w:rFonts w:ascii="Consolas" w:hAnsi="Consolas"/>
+          <w:color w:val="3F7F5F"/>
+          <w:sz w:val="20"/>
+          <w:szCs w:val="20"/>
+          <w:shd w:val="clear" w:color="auto" w:fill="FFFFFF"/>
+        </w:rPr>
+        <w:t>Tanktype</w:t>
+      </w:r>
+      <w:proofErr w:type="spellEnd"/>
+      <w:r>
+        <w:rPr>
+          <w:rFonts w:ascii="Consolas" w:hAnsi="Consolas"/>
+          <w:color w:val="3F7F5F"/>
+          <w:sz w:val="20"/>
+          <w:szCs w:val="20"/>
+          <w:shd w:val="clear" w:color="auto" w:fill="FFFFFF"/>
+        </w:rPr>
+        <w:t xml:space="preserve"> = 1 (</w:t>
+      </w:r>
+      <w:r>
+        <w:rPr>
+          <w:rFonts w:ascii="Consolas" w:hAnsi="Consolas"/>
+          <w:color w:val="3F7F5F"/>
+          <w:sz w:val="20"/>
+          <w:szCs w:val="20"/>
+          <w:shd w:val="clear" w:color="auto" w:fill="FFFFFF"/>
+        </w:rPr>
+        <w:t>rectangular</w:t>
+      </w:r>
+      <w:r>
+        <w:rPr>
+          <w:rFonts w:ascii="Consolas" w:hAnsi="Consolas"/>
+          <w:color w:val="3F7F5F"/>
+          <w:sz w:val="20"/>
+          <w:szCs w:val="20"/>
+          <w:shd w:val="clear" w:color="auto" w:fill="FFFFFF"/>
+        </w:rPr>
+        <w:t>)</w:t>
+      </w:r>
+    </w:p>
+    <w:p>
+      <w:pPr>
+        <w:rPr>
+          <w:rFonts w:ascii="Consolas" w:hAnsi="Consolas"/>
+          <w:color w:val="3F7F5F"/>
+          <w:sz w:val="20"/>
+          <w:szCs w:val="20"/>
+          <w:shd w:val="clear" w:color="auto" w:fill="FFFFFF"/>
+        </w:rPr>
+      </w:pPr>
+    </w:p>
+    <w:p>
+      <w:pPr>
+        <w:rPr>
+          <w:rFonts w:ascii="Consolas" w:hAnsi="Consolas"/>
+          <w:color w:val="3F7F5F"/>
+          <w:sz w:val="20"/>
+          <w:szCs w:val="20"/>
+          <w:shd w:val="clear" w:color="auto" w:fill="FFFFFF"/>
+        </w:rPr>
+      </w:pPr>
+      <w:bookmarkStart w:id="0" w:name="_GoBack"/>
+      <w:bookmarkEnd w:id="0"/>
+    </w:p>
+    <w:p>
+      <w:proofErr w:type="gramStart"/>
+      <w:r>
+        <w:t>format</w:t>
+      </w:r>
+      <w:proofErr w:type="gramEnd"/>
+      <w:r>
+        <w:t xml:space="preserve"> </w:t>
+      </w:r>
+      <w:proofErr w:type="spellStart"/>
+      <w:r>
+        <w:t>setTankSettings:</w:t>
+      </w:r>
+      <w:r>
+        <w:t>TankType|TotalLiters|Width|Length|Radius</w:t>
+      </w:r>
+      <w:proofErr w:type="spellEnd"/>
+    </w:p>
+    <w:p/>
+    <w:p>
+      <w:r>
+        <w:t xml:space="preserve">Now if </w:t>
+      </w:r>
+      <w:proofErr w:type="spellStart"/>
+      <w:r>
+        <w:t>TankType</w:t>
+      </w:r>
+      <w:proofErr w:type="spellEnd"/>
+      <w:r>
+        <w:t xml:space="preserve"> = 0 you can only send Radius like this</w:t>
+      </w:r>
+    </w:p>
+    <w:p>
+      <w:proofErr w:type="spellStart"/>
+      <w:proofErr w:type="gramStart"/>
+      <w:r>
+        <w:t>setTankSettings</w:t>
+      </w:r>
+      <w:proofErr w:type="spellEnd"/>
+      <w:r>
+        <w:t>:</w:t>
+      </w:r>
+      <w:proofErr w:type="gramEnd"/>
+      <w:r>
+        <w:t>(</w:t>
+      </w:r>
+      <w:proofErr w:type="spellStart"/>
+      <w:r>
+        <w:t>TankType</w:t>
+      </w:r>
+      <w:proofErr w:type="spellEnd"/>
+      <w:r>
+        <w:t>=0)</w:t>
+      </w:r>
+      <w:r>
+        <w:t>|</w:t>
+      </w:r>
+      <w:r>
+        <w:t>(</w:t>
+      </w:r>
+      <w:proofErr w:type="spellStart"/>
+      <w:r>
+        <w:t>TotalLiters</w:t>
+      </w:r>
+      <w:proofErr w:type="spellEnd"/>
+      <w:r>
+        <w:t>=500)|(</w:t>
+      </w:r>
+      <w:r>
+        <w:t>Radius</w:t>
+      </w:r>
+      <w:r>
+        <w:t>=value in meter)</w:t>
+      </w:r>
+    </w:p>
+    <w:p/>
+    <w:p>
+      <w:proofErr w:type="gramStart"/>
+      <w:r>
+        <w:t>now</w:t>
+      </w:r>
+      <w:proofErr w:type="gramEnd"/>
+      <w:r>
+        <w:t xml:space="preserve"> if </w:t>
+      </w:r>
+      <w:proofErr w:type="spellStart"/>
+      <w:r>
+        <w:t>Tanktype</w:t>
+      </w:r>
+      <w:proofErr w:type="spellEnd"/>
+      <w:r>
+        <w:t>=1 you can send width and length like following</w:t>
+      </w:r>
+    </w:p>
+    <w:p>
+      <w:proofErr w:type="spellStart"/>
+      <w:proofErr w:type="gramStart"/>
+      <w:r>
+        <w:t>setTankSettings</w:t>
+      </w:r>
+      <w:proofErr w:type="spellEnd"/>
+      <w:r>
+        <w:t>:</w:t>
+      </w:r>
+      <w:proofErr w:type="gramEnd"/>
+      <w:r>
+        <w:t>(</w:t>
+      </w:r>
+      <w:proofErr w:type="spellStart"/>
+      <w:r>
+        <w:t>TankType</w:t>
+      </w:r>
+      <w:proofErr w:type="spellEnd"/>
+      <w:r>
+        <w:t>=1</w:t>
+      </w:r>
+      <w:r>
+        <w:t>)|(</w:t>
+      </w:r>
+      <w:proofErr w:type="spellStart"/>
+      <w:r>
+        <w:t>TotalLiters</w:t>
+      </w:r>
+      <w:proofErr w:type="spellEnd"/>
+      <w:r>
+        <w:t>=500)|(</w:t>
+      </w:r>
+      <w:r>
+        <w:t>Width</w:t>
+      </w:r>
+      <w:r>
+        <w:t>=value in meter)</w:t>
+      </w:r>
+      <w:r>
+        <w:t>|</w:t>
+      </w:r>
+      <w:r>
+        <w:t xml:space="preserve"> </w:t>
+      </w:r>
+      <w:r>
+        <w:t>(</w:t>
+      </w:r>
+      <w:r>
+        <w:t>length</w:t>
+      </w:r>
+      <w:r>
+        <w:t>=value in meter)</w:t>
+      </w:r>
+    </w:p>
+    <w:p/>
+    <w:p>
+      <w:pPr>
+        <w:rPr>
+          <w:color w:val="000000"/>
+        </w:rPr>
+      </w:pPr>
+    </w:p>
+    <w:p>
+      <w:pPr>
+        <w:rPr>
+          <w:color w:val="000000"/>
+        </w:rPr>
+      </w:pPr>
+    </w:p>
+    <w:p>
+      <w:pPr>
+        <w:rPr>
+          <w:color w:val="000000"/>
+        </w:rPr>
+      </w:pPr>
+    </w:p>
+    <w:p>
+      <w:pPr>
+        <w:rPr>
+          <w:color w:val="000000"/>
+        </w:rPr>
+      </w:pPr>
+    </w:p>
+    <w:p>
+      <w:pPr>
+        <w:rPr>
+          <w:color w:val="000000"/>
+        </w:rPr>
+      </w:pPr>
+      <w:proofErr w:type="gramStart"/>
+      <w:r>
+        <w:t>format</w:t>
+      </w:r>
+      <w:proofErr w:type="gramEnd"/>
       <w:r>
         <w:t xml:space="preserve">   </w:t>
       </w:r>
       <w:proofErr w:type="spellStart"/>
       <w:r>
-        <w:t>setTimedate:epoch|</w:t>
-      </w:r>
-      <w:r>
-        <w:rPr>
-          <w:u w:val="single"/>
-        </w:rPr>
-        <w:t>timezone</w:t>
-      </w:r>
-      <w:proofErr w:type="spellEnd"/>
-      <w:r>
-        <w:t xml:space="preserve">    </w:t>
-      </w:r>
-      <w:proofErr w:type="spellStart"/>
-      <w:r>
-        <w:t>Reply:ACK</w:t>
-      </w:r>
-      <w:proofErr w:type="spellEnd"/>
-      <w:r>
-        <w:t>/NACK</w:t>
-      </w:r>
-    </w:p>
-    <w:p>
-      <w:pPr>
-        <w:rPr>
-          <w:color w:val="000000"/>
-        </w:rPr>
-      </w:pPr>
-      <w:r>
-        <w:rPr>
-          <w:color w:val="000000"/>
-        </w:rPr>
-        <w:tab/>
-      </w:r>
-      <w:r>
-        <w:rPr>
-          <w:color w:val="000000"/>
-        </w:rPr>
-        <w:tab/>
-      </w:r>
+        <w:t>getSoCnDCur</w:t>
+      </w:r>
+      <w:proofErr w:type="spellEnd"/>
+      <w:r>
+        <w:t xml:space="preserve">     Reply: </w:t>
+      </w:r>
+      <w:proofErr w:type="spellStart"/>
+      <w:r>
+        <w:t>SoC|CurrentOffset</w:t>
+      </w:r>
+      <w:proofErr w:type="spellEnd"/>
+    </w:p>
+    <w:p>
+      <w:pPr>
+        <w:rPr>
+          <w:color w:val="000000"/>
+        </w:rPr>
+      </w:pPr>
+    </w:p>
+    <w:p>
+      <w:pPr>
+        <w:rPr>
+          <w:color w:val="000000"/>
+        </w:rPr>
+      </w:pPr>
     </w:p>
     <w:p>
       <w:pPr>
@@ -341,288 +1077,6 @@
       <w:r>
         <w:t xml:space="preserve"> </w:t>
       </w:r>
-      <w:r>
-        <w:t xml:space="preserve">  </w:t>
-      </w:r>
-      <w:proofErr w:type="spellStart"/>
-      <w:r>
-        <w:t>setFuelMeasurement:</w:t>
-      </w:r>
-      <w:r>
-        <w:rPr>
-          <w:u w:val="single"/>
-        </w:rPr>
-        <w:t>zerospan</w:t>
-      </w:r>
-      <w:r>
-        <w:t>|</w:t>
-      </w:r>
-      <w:r>
-        <w:rPr>
-          <w:u w:val="single"/>
-        </w:rPr>
-        <w:t>fullspan</w:t>
-      </w:r>
-      <w:proofErr w:type="spellEnd"/>
-      <w:r>
-        <w:t xml:space="preserve">  </w:t>
-      </w:r>
-      <w:proofErr w:type="spellStart"/>
-      <w:r>
-        <w:t>Reply:ACK</w:t>
-      </w:r>
-      <w:proofErr w:type="spellEnd"/>
-      <w:r>
-        <w:t>/NACK</w:t>
-      </w:r>
-    </w:p>
-    <w:p>
-      <w:pPr>
-        <w:rPr>
-          <w:color w:val="000000"/>
-        </w:rPr>
-      </w:pPr>
-    </w:p>
-    <w:p>
-      <w:pPr>
-        <w:rPr>
-          <w:color w:val="000000"/>
-        </w:rPr>
-      </w:pPr>
-    </w:p>
-    <w:p>
-      <w:pPr>
-        <w:rPr>
-          <w:color w:val="000000"/>
-        </w:rPr>
-      </w:pPr>
-    </w:p>
-    <w:p>
-      <w:pPr>
-        <w:rPr>
-          <w:color w:val="000000"/>
-        </w:rPr>
-      </w:pPr>
-      <w:proofErr w:type="gramStart"/>
-      <w:r>
-        <w:t>format</w:t>
-      </w:r>
-      <w:proofErr w:type="gramEnd"/>
-      <w:r>
-        <w:t xml:space="preserve"> </w:t>
-      </w:r>
-      <w:r>
-        <w:t xml:space="preserve">  </w:t>
-      </w:r>
-      <w:proofErr w:type="spellStart"/>
-      <w:r>
-        <w:t>setSoCnDCur:SOC|CurrentOffset</w:t>
-      </w:r>
-      <w:proofErr w:type="spellEnd"/>
-      <w:r>
-        <w:t xml:space="preserve">    </w:t>
-      </w:r>
-      <w:proofErr w:type="spellStart"/>
-      <w:r>
-        <w:t>Reply:ACK</w:t>
-      </w:r>
-      <w:proofErr w:type="spellEnd"/>
-      <w:r>
-        <w:t>/NACK</w:t>
-      </w:r>
-    </w:p>
-    <w:p>
-      <w:pPr>
-        <w:rPr>
-          <w:color w:val="000000"/>
-        </w:rPr>
-      </w:pPr>
-    </w:p>
-    <w:p>
-      <w:pPr>
-        <w:rPr>
-          <w:color w:val="000000"/>
-        </w:rPr>
-      </w:pPr>
-    </w:p>
-    <w:p>
-      <w:pPr>
-        <w:rPr>
-          <w:color w:val="000000"/>
-        </w:rPr>
-      </w:pPr>
-      <w:proofErr w:type="gramStart"/>
-      <w:r>
-        <w:t>format</w:t>
-      </w:r>
-      <w:proofErr w:type="gramEnd"/>
-      <w:r>
-        <w:t xml:space="preserve"> </w:t>
-      </w:r>
-      <w:r>
-        <w:t xml:space="preserve">  </w:t>
-      </w:r>
-      <w:proofErr w:type="spellStart"/>
-      <w:r>
-        <w:t>setAutoManualMode</w:t>
-      </w:r>
-      <w:proofErr w:type="spellEnd"/>
-      <w:r>
-        <w:t xml:space="preserve">:(0 - Auto   1 - Manual) </w:t>
-      </w:r>
-      <w:proofErr w:type="spellStart"/>
-      <w:r>
-        <w:t>Reply:ACK</w:t>
-      </w:r>
-      <w:proofErr w:type="spellEnd"/>
-      <w:r>
-        <w:t>/NACK</w:t>
-      </w:r>
-    </w:p>
-    <w:p>
-      <w:pPr>
-        <w:rPr>
-          <w:color w:val="000000"/>
-        </w:rPr>
-      </w:pPr>
-    </w:p>
-    <w:p>
-      <w:pPr>
-        <w:rPr>
-          <w:color w:val="000000"/>
-        </w:rPr>
-      </w:pPr>
-    </w:p>
-    <w:p>
-      <w:pPr>
-        <w:rPr>
-          <w:color w:val="000000"/>
-        </w:rPr>
-      </w:pPr>
-      <w:proofErr w:type="gramStart"/>
-      <w:r>
-        <w:t>format</w:t>
-      </w:r>
-      <w:proofErr w:type="gramEnd"/>
-      <w:r>
-        <w:t xml:space="preserve"> </w:t>
-      </w:r>
-      <w:r>
-        <w:t xml:space="preserve">  </w:t>
-      </w:r>
-      <w:proofErr w:type="spellStart"/>
-      <w:r>
-        <w:t>setGenerator</w:t>
-      </w:r>
-      <w:proofErr w:type="spellEnd"/>
-      <w:r>
-        <w:t xml:space="preserve">: (0 - </w:t>
-      </w:r>
-      <w:proofErr w:type="spellStart"/>
-      <w:r>
-        <w:t>GeneratorOff</w:t>
-      </w:r>
-      <w:proofErr w:type="spellEnd"/>
-      <w:r>
-        <w:t xml:space="preserve">   1 - </w:t>
-      </w:r>
-      <w:proofErr w:type="spellStart"/>
-      <w:r>
-        <w:t>GeneratorOn</w:t>
-      </w:r>
-      <w:proofErr w:type="spellEnd"/>
-      <w:r>
-        <w:t xml:space="preserve">)  </w:t>
-      </w:r>
-      <w:proofErr w:type="spellStart"/>
-      <w:r>
-        <w:t>Reply:ACK</w:t>
-      </w:r>
-      <w:proofErr w:type="spellEnd"/>
-      <w:r>
-        <w:t>/NACK</w:t>
-      </w:r>
-    </w:p>
-    <w:p>
-      <w:pPr>
-        <w:rPr>
-          <w:color w:val="000000"/>
-        </w:rPr>
-      </w:pPr>
-    </w:p>
-    <w:p>
-      <w:pPr>
-        <w:rPr>
-          <w:color w:val="000000"/>
-        </w:rPr>
-      </w:pPr>
-    </w:p>
-    <w:p>
-      <w:pPr>
-        <w:rPr>
-          <w:color w:val="000000"/>
-        </w:rPr>
-      </w:pPr>
-      <w:proofErr w:type="gramStart"/>
-      <w:r>
-        <w:t>format</w:t>
-      </w:r>
-      <w:proofErr w:type="gramEnd"/>
-      <w:r>
-        <w:t xml:space="preserve"> </w:t>
-      </w:r>
-      <w:r>
-        <w:t xml:space="preserve">  </w:t>
-      </w:r>
-      <w:proofErr w:type="spellStart"/>
-      <w:r>
-        <w:t>getSoCnDCur</w:t>
-      </w:r>
-      <w:proofErr w:type="spellEnd"/>
-      <w:r>
-        <w:t xml:space="preserve">     Reply: </w:t>
-      </w:r>
-      <w:proofErr w:type="spellStart"/>
-      <w:r>
-        <w:t>SoC|CurrentOffset</w:t>
-      </w:r>
-      <w:proofErr w:type="spellEnd"/>
-    </w:p>
-    <w:p>
-      <w:pPr>
-        <w:rPr>
-          <w:color w:val="000000"/>
-        </w:rPr>
-      </w:pPr>
-    </w:p>
-    <w:p>
-      <w:pPr>
-        <w:rPr>
-          <w:color w:val="000000"/>
-        </w:rPr>
-      </w:pPr>
-    </w:p>
-    <w:p>
-      <w:pPr>
-        <w:rPr>
-          <w:color w:val="000000"/>
-        </w:rPr>
-      </w:pPr>
-    </w:p>
-    <w:p>
-      <w:pPr>
-        <w:rPr>
-          <w:color w:val="000000"/>
-        </w:rPr>
-      </w:pPr>
-      <w:proofErr w:type="gramStart"/>
-      <w:r>
-        <w:t>format</w:t>
-      </w:r>
-      <w:proofErr w:type="gramEnd"/>
-      <w:r>
-        <w:t xml:space="preserve"> </w:t>
-      </w:r>
       <w:proofErr w:type="spellStart"/>
       <w:r>
         <w:t>getSystemMode</w:t>
@@ -632,6 +1086,8 @@
         <w:t xml:space="preserve">   Reply: Auto/Manual   0 - Auto   1 - Manual</w:t>
       </w:r>
     </w:p>
+    <w:p/>
+    <w:p/>
     <w:p/>
     <w:sectPr>
       <w:pgSz w:w="12240" w:h="15840"/>
@@ -1036,6 +1492,7 @@
   <w:style w:type="paragraph" w:default="1" w:styleId="Normal">
     <w:name w:val="Normal"/>
     <w:qFormat/>
+    <w:rsid w:val="0070214E"/>
   </w:style>
   <w:style w:type="character" w:default="1" w:styleId="DefaultParagraphFont">
     <w:name w:val="Default Paragraph Font"/>

</xml_diff>